<commit_message>
feat(cad): video Modul 4 versi klik GUI; dimensi Draft dan lembar TechDraw lengkap
- Rekaman klik GUI asli 13:45:
  - grid dimatikan lewat Preferences; layer Kontur/Sumbu/Dimensi; gaya ISO-A4 (angka bulat)
  - pelat C15 dari Rectangle, segitiga Polyline Relative, dan Part Cut
  - dimensi Draft dengan Shift dan Select Edge (sudut dalam 135°); Label C15 × 45° dan Text
  - lembar TechDraw ISO A4 dengan dimensi lengkap berjarak sama dan kepala gambar terisi; ekspor PDF
- Teks langkah 1-7, Gambar 7, tabel gejala, dan baris Decimals disesuaikan.

Co-Authored-By: Claude Opus 5.5 <noreply@anthropic.com>
</commit_message>
<xml_diff>
--- a/Pemodelan-Computer-Aided-Design/Modul-Word/Modul-4-Dimensi-Anotasi-dan-Format-Gambar-Teknik.docx
+++ b/Pemodelan-Computer-Aided-Design/Modul-Word/Modul-4-Dimensi-Anotasi-dan-Format-Gambar-Teknik.docx
@@ -7569,7 +7569,7 @@
                 <w:i w:val="0"/>
                 <w:sz w:val="18"/>
               </w:rPr>
-              <w:t>2 (0 untuk sudut bulat)</w:t>
+              <w:t>0 bila semua ukuran bulat (120, bukan 120,00); 2 bila ada pecahan</w:t>
             </w:r>
           </w:p>
         </w:tc>
@@ -9485,7 +9485,7 @@
           <w:i w:val="0"/>
           <w:sz w:val="20"/>
         </w:rPr>
-        <w:t>Gambar 7 — Gambar kerja target praktik: pelat berpinggul berlubang. Satuan mm; tampak Top (XY) dengan titik asal (0, 0) di sudut kiri-bawah pelat. Kontur 120 × 70, chamfer C15, dan lubang ⌀20 di (60, 35) dibuat pada langkah 2; dimensi 120, 70, baseline 60 dan 35, ⌀20, dua kaki 15, dan sudut 45° pada langkah 3; Label “C15 × 45°” dan Draft Text dua baris (bahan, toleransi umum) pada langkah 4.</w:t>
+        <w:t>Gambar 7 — Gambar kerja target praktik: pelat berpinggul berlubang. Satuan mm; tampak Top (XY) dengan titik asal (0, 0) di sudut kiri-bawah pelat. Kontur 120 × 70, chamfer C15, dan lubang ⌀20 di (60, 35) dibuat pada langkah 2; dimensi 120, 70, baseline 60 dan 35, ⌀20 (angkanya di luar lubang), dan sudut dalam 135° antara sisi atas dan chamfer pada langkah 3; Label “C15 × 45°” (kaki 15 mm, sudut 45°) dan Draft Text dua baris (bahan, toleransi umum) pada langkah 4. Garis sumbu lubang berada di layer Sumbu (Dashdot).</w:t>
       </w:r>
     </w:p>
     <w:p>
@@ -9509,16 +9509,124 @@
           <w:i w:val="0"/>
           <w:sz w:val="22"/>
         </w:rPr>
-        <w:t xml:space="preserve">Siapkan dokumen dan layer: </w:t>
-      </w:r>
-      <w:r>
-        <w:rPr>
-          <w:rFonts w:ascii="Arial" w:hAnsi="Arial" w:eastAsia="Arial" w:cs="Arial"/>
-          <w:b w:val="0"/>
-          <w:i w:val="0"/>
-          <w:sz w:val="22"/>
-        </w:rPr>
-        <w:t>Ctrl+N, Draft, Top (XY), mm. Buat layer Kontur, Sumbu, dan Dimensi. Draft → Annotation styles… buat gaya ISO-A4: FontSize 3,5; ArrowSize 2; Decimals 2; ShowUnit off.</w:t>
+        <w:t xml:space="preserve">Siapkan dokumen, layer, dan gaya: </w:t>
+      </w:r>
+      <w:r>
+        <w:rPr>
+          <w:rFonts w:ascii="Arial" w:hAnsi="Arial" w:eastAsia="Arial" w:cs="Arial"/>
+          <w:b w:val="0"/>
+          <w:i w:val="0"/>
+          <w:sz w:val="22"/>
+        </w:rPr>
+        <w:t xml:space="preserve">Workbench Draft. Edit → Preferences → Draft → Grid and Snapping: hapus centang </w:t>
+      </w:r>
+      <w:r>
+        <w:rPr>
+          <w:rFonts w:ascii="Arial" w:hAnsi="Arial" w:eastAsia="Arial" w:cs="Arial"/>
+          <w:b w:val="0"/>
+          <w:i/>
+          <w:sz w:val="22"/>
+        </w:rPr>
+        <w:t>Always show the grid</w:t>
+      </w:r>
+      <w:r>
+        <w:rPr>
+          <w:rFonts w:ascii="Arial" w:hAnsi="Arial" w:eastAsia="Arial" w:cs="Arial"/>
+          <w:b w:val="0"/>
+          <w:i w:val="0"/>
+          <w:sz w:val="22"/>
+        </w:rPr>
+        <w:t xml:space="preserve"> dan </w:t>
+      </w:r>
+      <w:r>
+        <w:rPr>
+          <w:rFonts w:ascii="Arial" w:hAnsi="Arial" w:eastAsia="Arial" w:cs="Arial"/>
+          <w:b w:val="0"/>
+          <w:i/>
+          <w:sz w:val="22"/>
+        </w:rPr>
+        <w:t>Show the grid during commands</w:t>
+      </w:r>
+      <w:r>
+        <w:rPr>
+          <w:rFonts w:ascii="Arial" w:hAnsi="Arial" w:eastAsia="Arial" w:cs="Arial"/>
+          <w:b w:val="0"/>
+          <w:i w:val="0"/>
+          <w:sz w:val="22"/>
+        </w:rPr>
+        <w:t xml:space="preserve"> agar grid tidak tampil sama sekali. File → New Document, working plane Top (XY); snap Endpoint dan Center aktif. Buat layer (Utilities → New Layer): </w:t>
+      </w:r>
+      <w:r>
+        <w:rPr>
+          <w:rFonts w:ascii="Arial" w:hAnsi="Arial" w:eastAsia="Arial" w:cs="Arial"/>
+          <w:b/>
+          <w:i w:val="0"/>
+          <w:sz w:val="22"/>
+        </w:rPr>
+        <w:t>Kontur</w:t>
+      </w:r>
+      <w:r>
+        <w:rPr>
+          <w:rFonts w:ascii="Arial" w:hAnsi="Arial" w:eastAsia="Arial" w:cs="Arial"/>
+          <w:b w:val="0"/>
+          <w:i w:val="0"/>
+          <w:sz w:val="22"/>
+        </w:rPr>
+        <w:t xml:space="preserve"> Line Width 3; </w:t>
+      </w:r>
+      <w:r>
+        <w:rPr>
+          <w:rFonts w:ascii="Arial" w:hAnsi="Arial" w:eastAsia="Arial" w:cs="Arial"/>
+          <w:b/>
+          <w:i w:val="0"/>
+          <w:sz w:val="22"/>
+        </w:rPr>
+        <w:t>Sumbu</w:t>
+      </w:r>
+      <w:r>
+        <w:rPr>
+          <w:rFonts w:ascii="Arial" w:hAnsi="Arial" w:eastAsia="Arial" w:cs="Arial"/>
+          <w:b w:val="0"/>
+          <w:i w:val="0"/>
+          <w:sz w:val="22"/>
+        </w:rPr>
+        <w:t xml:space="preserve"> Line Width 1, Draw Style Dashdot, warna merah; </w:t>
+      </w:r>
+      <w:r>
+        <w:rPr>
+          <w:rFonts w:ascii="Arial" w:hAnsi="Arial" w:eastAsia="Arial" w:cs="Arial"/>
+          <w:b/>
+          <w:i w:val="0"/>
+          <w:sz w:val="22"/>
+        </w:rPr>
+        <w:t>Dimensi</w:t>
+      </w:r>
+      <w:r>
+        <w:rPr>
+          <w:rFonts w:ascii="Arial" w:hAnsi="Arial" w:eastAsia="Arial" w:cs="Arial"/>
+          <w:b w:val="0"/>
+          <w:i w:val="0"/>
+          <w:sz w:val="22"/>
+        </w:rPr>
+        <w:t xml:space="preserve"> Line Width 1. Annotation → Annotation Styles → </w:t>
+      </w:r>
+      <w:r>
+        <w:rPr>
+          <w:rFonts w:ascii="Arial" w:hAnsi="Arial" w:eastAsia="Arial" w:cs="Arial"/>
+          <w:b w:val="0"/>
+          <w:i/>
+          <w:sz w:val="22"/>
+        </w:rPr>
+        <w:t>Add new…</w:t>
+      </w:r>
+      <w:r>
+        <w:rPr>
+          <w:rFonts w:ascii="Arial" w:hAnsi="Arial" w:eastAsia="Arial" w:cs="Arial"/>
+          <w:b w:val="0"/>
+          <w:i w:val="0"/>
+          <w:sz w:val="22"/>
+        </w:rPr>
+        <w:t xml:space="preserve"> “ISO-A4”: Font size 3,5; Start/End arrow type Arrow, ukuran 1; Show unit mati; Number of decimals 0 (semua ukuran bulat, jadi tampil 120, bukan 120,00).</w:t>
       </w:r>
     </w:p>
     <w:p>
@@ -9542,16 +9650,52 @@
           <w:i w:val="0"/>
           <w:sz w:val="22"/>
         </w:rPr>
-        <w:t xml:space="preserve">Kontur dan lubang: </w:t>
-      </w:r>
-      <w:r>
-        <w:rPr>
-          <w:rFonts w:ascii="Arial" w:hAnsi="Arial" w:eastAsia="Arial" w:cs="Arial"/>
-          <w:b w:val="0"/>
-          <w:i w:val="0"/>
-          <w:sz w:val="22"/>
-        </w:rPr>
-        <w:t>Pada layer Kontur: Draft Wire pelat 120 × 70 dengan chamfer C15 di sudut kanan-atas (lihat Gambar 1), Draft Circle ⌀20 di (60, 35), Part Cut. Pada layer Sumbu: dua Draft Line sumbu lubang, gaya Dashdot.</w:t>
+        <w:t xml:space="preserve">Kontur, lubang, dan sumbu: </w:t>
+      </w:r>
+      <w:r>
+        <w:rPr>
+          <w:rFonts w:ascii="Arial" w:hAnsi="Arial" w:eastAsia="Arial" w:cs="Arial"/>
+          <w:b w:val="0"/>
+          <w:i w:val="0"/>
+          <w:sz w:val="22"/>
+        </w:rPr>
+        <w:t xml:space="preserve">Klik kanan layer Kontur → </w:t>
+      </w:r>
+      <w:r>
+        <w:rPr>
+          <w:rFonts w:ascii="Arial" w:hAnsi="Arial" w:eastAsia="Arial" w:cs="Arial"/>
+          <w:b/>
+          <w:i w:val="0"/>
+          <w:sz w:val="22"/>
+        </w:rPr>
+        <w:t>Activate Layer</w:t>
+      </w:r>
+      <w:r>
+        <w:rPr>
+          <w:rFonts w:ascii="Arial" w:hAnsi="Arial" w:eastAsia="Arial" w:cs="Arial"/>
+          <w:b w:val="0"/>
+          <w:i w:val="0"/>
+          <w:sz w:val="22"/>
+        </w:rPr>
+        <w:t xml:space="preserve"> (objek Draft baru langsung masuk layer ini). Rectangle dengan Make face dari (0, 0, 0) ke (120, 70, 0). Circle Make face: arahkan kursor ke face persegi panjang; snap Center memberi titik tengahnya (60, 35); radius 10. Segitiga C15: Drafting → Polyline (Make face), titik pertama snap Endpoint di sudut (120, 70), centang </w:t>
+      </w:r>
+      <w:r>
+        <w:rPr>
+          <w:rFonts w:ascii="Arial" w:hAnsi="Arial" w:eastAsia="Arial" w:cs="Arial"/>
+          <w:b/>
+          <w:i w:val="0"/>
+          <w:sz w:val="22"/>
+        </w:rPr>
+        <w:t>Relative</w:t>
+      </w:r>
+      <w:r>
+        <w:rPr>
+          <w:rFonts w:ascii="Arial" w:hAnsi="Arial" w:eastAsia="Arial" w:cs="Arial"/>
+          <w:b w:val="0"/>
+          <w:i w:val="0"/>
+          <w:sz w:val="22"/>
+        </w:rPr>
+        <w:t>, ketik (−15, 0) dan (15, −15), lalu Close. Workbench Part → Boolean → Cut: persegi panjang − segitiga, lalu hasilnya − lingkaran → Cut001; masukkan ke layer Kontur. Aktifkan layer Sumbu, Line (Relative dimatikan) dari (45, 35) ke (75, 35), lalu Rotate + Copy 90° dengan pusat diklik di tepi lubang (snap Center) → sumbu tegak.</w:t>
       </w:r>
     </w:p>
     <w:p>
@@ -9584,7 +9728,25 @@
           <w:i w:val="0"/>
           <w:sz w:val="22"/>
         </w:rPr>
-        <w:t>Pada layer Dimensi: linear 120 (bawah) dan 70 (kiri), posisi lubang 60 dan 35 sebagai baseline dari sudut kiri-bawah, diameter ⌀20, dua kaki chamfer 15, angular 45°. Terapkan gaya ISO-A4 pada semuanya.</w:t>
+        <w:t xml:space="preserve">Aktifkan layer Dimensi. Annotation → Dimension: 120 (dua sudut bawah) dan 70 (dua sudut kiri); baseline 60 dan 35 dari titik asal ke pusat lubang sambil </w:t>
+      </w:r>
+      <w:r>
+        <w:rPr>
+          <w:rFonts w:ascii="Arial" w:hAnsi="Arial" w:eastAsia="Arial" w:cs="Arial"/>
+          <w:b/>
+          <w:i w:val="0"/>
+          <w:sz w:val="22"/>
+        </w:rPr>
+        <w:t>menahan Shift</w:t>
+      </w:r>
+      <w:r>
+        <w:rPr>
+          <w:rFonts w:ascii="Arial" w:hAnsi="Arial" w:eastAsia="Arial" w:cs="Arial"/>
+          <w:b w:val="0"/>
+          <w:i w:val="0"/>
+          <w:sz w:val="22"/>
+        </w:rPr>
+        <w:t xml:space="preserve"> agar dimensi mendatar atau tegak; mode Select Edge pada tepi lubang → ⌀20; Select Edge sisi atas lalu Alt+klik chamfer → sudut dalam 135° (= 180° − 45°; Draft hanya mengukur sudut di antara dua tepi yang ada). Pilih semua dimensi → View → Annotation Style = ISO-A4. Angka ⌀20 dipindah keluar lubang lewat View → Text Position (74, 45) agar tidak menimpa garis sumbu.</w:t>
       </w:r>
     </w:p>
     <w:p>
@@ -9617,7 +9779,7 @@
           <w:i w:val="0"/>
           <w:sz w:val="22"/>
         </w:rPr>
-        <w:t>Draft Label Custom “C15 × 45°” berpanah ke sisi chamfer; Draft Text dua baris: bahan dan toleransi umum. Masukkan ke layer Dimensi.</w:t>
+        <w:t>Annotation → Label: klik tengah chamfer, klik ujung penunjuk, klik letak teks; Data → Custom Text = “C15 × 45°” (kaki 15 mm dan sudut 45° dalam satu catatan). Annotation → Text: “Bahan: S275JR” ⏎ “Toleransi umum: ISO 2768-m” ⏎ ⏎. Label dan Text → Annotation Style ISO-A4; keduanya otomatis berada di layer Dimensi.</w:t>
       </w:r>
     </w:p>
     <w:p>
@@ -9650,7 +9812,7 @@
           <w:i w:val="0"/>
           <w:sz w:val="22"/>
         </w:rPr>
-        <w:t>Python console: App.ActiveDocument.Cut.Shape.Area → 7.973,34 mm². Sembunyikan layer Dimensi (Spasi) dan pastikan kontur tetap bersih.</w:t>
+        <w:t>Python console: App.ActiveDocument.Cut001.Shape.Area → 7.973,34 mm². Pilih layer Dimensi, tekan Spasi untuk menyembunyikan semua anotasi (kontur tetap bersih), lalu Spasi lagi untuk menampilkannya.</w:t>
       </w:r>
     </w:p>
     <w:p>
@@ -9683,7 +9845,61 @@
           <w:i w:val="0"/>
           <w:sz w:val="22"/>
         </w:rPr>
-        <w:t>TechDraw → Page Default; pilih objek Cut → Insert View; Scale 1:1; isi kepala gambar (judul, bahan, skala, nama); tambahkan TechDraw Length dimension untuk membandingkan dengan Draft Dimension.</w:t>
+        <w:t xml:space="preserve">Workbench TechDraw → Page → </w:t>
+      </w:r>
+      <w:r>
+        <w:rPr>
+          <w:rFonts w:ascii="Arial" w:hAnsi="Arial" w:eastAsia="Arial" w:cs="Arial"/>
+          <w:b/>
+          <w:i w:val="0"/>
+          <w:sz w:val="22"/>
+        </w:rPr>
+        <w:t>New Page From Template</w:t>
+      </w:r>
+      <w:r>
+        <w:rPr>
+          <w:rFonts w:ascii="Arial" w:hAnsi="Arial" w:eastAsia="Arial" w:cs="Arial"/>
+          <w:b w:val="0"/>
+          <w:i w:val="0"/>
+          <w:sz w:val="22"/>
+        </w:rPr>
+        <w:t xml:space="preserve"> → ISO/A4_Landscape_ISO5457_minimal.svg. Pilih Cut001 → TechDraw Views → New View, tombol kamera (arah Top dari tampilan 3D) → OK; Data → X 150, Y 132 (tengah area gambar, lega dari garis tepi dan kepala gambar), lalu Recompute. Klik kolom kepala gambar: Title, Created by, Approved by (nama dosen pengampu), Part Material. Klik tepi lubang → Centerlines/Threading → </w:t>
+      </w:r>
+      <w:r>
+        <w:rPr>
+          <w:rFonts w:ascii="Arial" w:hAnsi="Arial" w:eastAsia="Arial" w:cs="Arial"/>
+          <w:b/>
+          <w:i w:val="0"/>
+          <w:sz w:val="22"/>
+        </w:rPr>
+        <w:t>Circle Centerlines</w:t>
+      </w:r>
+      <w:r>
+        <w:rPr>
+          <w:rFonts w:ascii="Arial" w:hAnsi="Arial" w:eastAsia="Arial" w:cs="Arial"/>
+          <w:b w:val="0"/>
+          <w:i w:val="0"/>
+          <w:sz w:val="22"/>
+        </w:rPr>
+        <w:t xml:space="preserve">. Dimensi lembar: tepi bawah → Length (120); tepi kiri → Vertical Length (70); tepi kiri + garis sumbu tegak → Horizontal Length (60); tepi bawah + garis sumbu mendatar → Vertical Length (35); tepi lubang → Diameter (⌀20); dua titik ujung chamfer → Format/Organize Dimensions → </w:t>
+      </w:r>
+      <w:r>
+        <w:rPr>
+          <w:rFonts w:ascii="Arial" w:hAnsi="Arial" w:eastAsia="Arial" w:cs="Arial"/>
+          <w:b/>
+          <w:i w:val="0"/>
+          <w:sz w:val="22"/>
+        </w:rPr>
+        <w:t>Horizontal Chamfer Dimension</w:t>
+      </w:r>
+      <w:r>
+        <w:rPr>
+          <w:rFonts w:ascii="Arial" w:hAnsi="Arial" w:eastAsia="Arial" w:cs="Arial"/>
+          <w:b w:val="0"/>
+          <w:i w:val="0"/>
+          <w:sz w:val="22"/>
+        </w:rPr>
+        <w:t xml:space="preserve"> (15 × 45°). Seret setiap angka ke tempatnya: berjenjang, tidak menempel garis benda, tidak saling menumpuk.</w:t>
       </w:r>
     </w:p>
     <w:p>
@@ -9716,7 +9932,7 @@
           <w:i w:val="0"/>
           <w:sz w:val="22"/>
         </w:rPr>
-        <w:t>Ctrl+S → Latihan4_NIM.FCStd; TechDraw → Export page as PDF sebagai latihan (PDF tidak diunggah, .FCStd yang diunggah).</w:t>
+        <w:t>Ctrl+S → Latihan4_NIM.FCStd; File → Export PDF → Latihan4_NIM.pdf sebagai latihan (PDF tidak diunggah, .FCStd yang diunggah).</w:t>
       </w:r>
     </w:p>
     <w:p>
@@ -10002,7 +10218,7 @@
                 <w:i w:val="0"/>
                 <w:sz w:val="18"/>
               </w:rPr>
-              <w:t>Sudut angular menampilkan 135°</w:t>
+              <w:t>Sudut chamfer tampil 225°, bukan 135°</w:t>
             </w:r>
           </w:p>
         </w:tc>
@@ -10021,7 +10237,7 @@
                 <w:i w:val="0"/>
                 <w:sz w:val="18"/>
               </w:rPr>
-              <w:t>Busur dimensi ditempatkan di sisi luar</w:t>
+              <w:t>Busur dimensi diletakkan di luar pelat (sudut refleks)</w:t>
             </w:r>
           </w:p>
         </w:tc>
@@ -10040,7 +10256,7 @@
                 <w:i w:val="0"/>
                 <w:sz w:val="18"/>
               </w:rPr>
-              <w:t>Pindahkan titik penempatan ke dalam sudut 45°</w:t>
+              <w:t>Letakkan titik busur di dalam pelat, di antara sisi atas dan chamfer</w:t>
             </w:r>
           </w:p>
         </w:tc>

</xml_diff>

<commit_message>
feat(cad): video Modul 4 versi klik GUI; dimensi Draft dan lembar TechDraw lengkap (#1039)
- Rekaman klik GUI asli 13:45:
  - grid dimatikan lewat Preferences; layer Kontur/Sumbu/Dimensi; gaya ISO-A4 (angka bulat)
  - pelat C15 dari Rectangle, segitiga Polyline Relative, dan Part Cut
  - dimensi Draft dengan Shift dan Select Edge (sudut dalam 135°); Label C15 × 45° dan Text
  - lembar TechDraw ISO A4 dengan dimensi lengkap berjarak sama dan kepala gambar terisi; ekspor PDF
- Teks langkah 1-7, Gambar 7, tabel gejala, dan baris Decimals disesuaikan.

Co-authored-by: Claude Opus 5.5 <noreply@anthropic.com>
</commit_message>
<xml_diff>
--- a/Pemodelan-Computer-Aided-Design/Modul-Word/Modul-4-Dimensi-Anotasi-dan-Format-Gambar-Teknik.docx
+++ b/Pemodelan-Computer-Aided-Design/Modul-Word/Modul-4-Dimensi-Anotasi-dan-Format-Gambar-Teknik.docx
@@ -7569,7 +7569,7 @@
                 <w:i w:val="0"/>
                 <w:sz w:val="18"/>
               </w:rPr>
-              <w:t>2 (0 untuk sudut bulat)</w:t>
+              <w:t>0 bila semua ukuran bulat (120, bukan 120,00); 2 bila ada pecahan</w:t>
             </w:r>
           </w:p>
         </w:tc>
@@ -9485,7 +9485,7 @@
           <w:i w:val="0"/>
           <w:sz w:val="20"/>
         </w:rPr>
-        <w:t>Gambar 7 — Gambar kerja target praktik: pelat berpinggul berlubang. Satuan mm; tampak Top (XY) dengan titik asal (0, 0) di sudut kiri-bawah pelat. Kontur 120 × 70, chamfer C15, dan lubang ⌀20 di (60, 35) dibuat pada langkah 2; dimensi 120, 70, baseline 60 dan 35, ⌀20, dua kaki 15, dan sudut 45° pada langkah 3; Label “C15 × 45°” dan Draft Text dua baris (bahan, toleransi umum) pada langkah 4.</w:t>
+        <w:t>Gambar 7 — Gambar kerja target praktik: pelat berpinggul berlubang. Satuan mm; tampak Top (XY) dengan titik asal (0, 0) di sudut kiri-bawah pelat. Kontur 120 × 70, chamfer C15, dan lubang ⌀20 di (60, 35) dibuat pada langkah 2; dimensi 120, 70, baseline 60 dan 35, ⌀20 (angkanya di luar lubang), dan sudut dalam 135° antara sisi atas dan chamfer pada langkah 3; Label “C15 × 45°” (kaki 15 mm, sudut 45°) dan Draft Text dua baris (bahan, toleransi umum) pada langkah 4. Garis sumbu lubang berada di layer Sumbu (Dashdot).</w:t>
       </w:r>
     </w:p>
     <w:p>
@@ -9509,16 +9509,124 @@
           <w:i w:val="0"/>
           <w:sz w:val="22"/>
         </w:rPr>
-        <w:t xml:space="preserve">Siapkan dokumen dan layer: </w:t>
-      </w:r>
-      <w:r>
-        <w:rPr>
-          <w:rFonts w:ascii="Arial" w:hAnsi="Arial" w:eastAsia="Arial" w:cs="Arial"/>
-          <w:b w:val="0"/>
-          <w:i w:val="0"/>
-          <w:sz w:val="22"/>
-        </w:rPr>
-        <w:t>Ctrl+N, Draft, Top (XY), mm. Buat layer Kontur, Sumbu, dan Dimensi. Draft → Annotation styles… buat gaya ISO-A4: FontSize 3,5; ArrowSize 2; Decimals 2; ShowUnit off.</w:t>
+        <w:t xml:space="preserve">Siapkan dokumen, layer, dan gaya: </w:t>
+      </w:r>
+      <w:r>
+        <w:rPr>
+          <w:rFonts w:ascii="Arial" w:hAnsi="Arial" w:eastAsia="Arial" w:cs="Arial"/>
+          <w:b w:val="0"/>
+          <w:i w:val="0"/>
+          <w:sz w:val="22"/>
+        </w:rPr>
+        <w:t xml:space="preserve">Workbench Draft. Edit → Preferences → Draft → Grid and Snapping: hapus centang </w:t>
+      </w:r>
+      <w:r>
+        <w:rPr>
+          <w:rFonts w:ascii="Arial" w:hAnsi="Arial" w:eastAsia="Arial" w:cs="Arial"/>
+          <w:b w:val="0"/>
+          <w:i/>
+          <w:sz w:val="22"/>
+        </w:rPr>
+        <w:t>Always show the grid</w:t>
+      </w:r>
+      <w:r>
+        <w:rPr>
+          <w:rFonts w:ascii="Arial" w:hAnsi="Arial" w:eastAsia="Arial" w:cs="Arial"/>
+          <w:b w:val="0"/>
+          <w:i w:val="0"/>
+          <w:sz w:val="22"/>
+        </w:rPr>
+        <w:t xml:space="preserve"> dan </w:t>
+      </w:r>
+      <w:r>
+        <w:rPr>
+          <w:rFonts w:ascii="Arial" w:hAnsi="Arial" w:eastAsia="Arial" w:cs="Arial"/>
+          <w:b w:val="0"/>
+          <w:i/>
+          <w:sz w:val="22"/>
+        </w:rPr>
+        <w:t>Show the grid during commands</w:t>
+      </w:r>
+      <w:r>
+        <w:rPr>
+          <w:rFonts w:ascii="Arial" w:hAnsi="Arial" w:eastAsia="Arial" w:cs="Arial"/>
+          <w:b w:val="0"/>
+          <w:i w:val="0"/>
+          <w:sz w:val="22"/>
+        </w:rPr>
+        <w:t xml:space="preserve"> agar grid tidak tampil sama sekali. File → New Document, working plane Top (XY); snap Endpoint dan Center aktif. Buat layer (Utilities → New Layer): </w:t>
+      </w:r>
+      <w:r>
+        <w:rPr>
+          <w:rFonts w:ascii="Arial" w:hAnsi="Arial" w:eastAsia="Arial" w:cs="Arial"/>
+          <w:b/>
+          <w:i w:val="0"/>
+          <w:sz w:val="22"/>
+        </w:rPr>
+        <w:t>Kontur</w:t>
+      </w:r>
+      <w:r>
+        <w:rPr>
+          <w:rFonts w:ascii="Arial" w:hAnsi="Arial" w:eastAsia="Arial" w:cs="Arial"/>
+          <w:b w:val="0"/>
+          <w:i w:val="0"/>
+          <w:sz w:val="22"/>
+        </w:rPr>
+        <w:t xml:space="preserve"> Line Width 3; </w:t>
+      </w:r>
+      <w:r>
+        <w:rPr>
+          <w:rFonts w:ascii="Arial" w:hAnsi="Arial" w:eastAsia="Arial" w:cs="Arial"/>
+          <w:b/>
+          <w:i w:val="0"/>
+          <w:sz w:val="22"/>
+        </w:rPr>
+        <w:t>Sumbu</w:t>
+      </w:r>
+      <w:r>
+        <w:rPr>
+          <w:rFonts w:ascii="Arial" w:hAnsi="Arial" w:eastAsia="Arial" w:cs="Arial"/>
+          <w:b w:val="0"/>
+          <w:i w:val="0"/>
+          <w:sz w:val="22"/>
+        </w:rPr>
+        <w:t xml:space="preserve"> Line Width 1, Draw Style Dashdot, warna merah; </w:t>
+      </w:r>
+      <w:r>
+        <w:rPr>
+          <w:rFonts w:ascii="Arial" w:hAnsi="Arial" w:eastAsia="Arial" w:cs="Arial"/>
+          <w:b/>
+          <w:i w:val="0"/>
+          <w:sz w:val="22"/>
+        </w:rPr>
+        <w:t>Dimensi</w:t>
+      </w:r>
+      <w:r>
+        <w:rPr>
+          <w:rFonts w:ascii="Arial" w:hAnsi="Arial" w:eastAsia="Arial" w:cs="Arial"/>
+          <w:b w:val="0"/>
+          <w:i w:val="0"/>
+          <w:sz w:val="22"/>
+        </w:rPr>
+        <w:t xml:space="preserve"> Line Width 1. Annotation → Annotation Styles → </w:t>
+      </w:r>
+      <w:r>
+        <w:rPr>
+          <w:rFonts w:ascii="Arial" w:hAnsi="Arial" w:eastAsia="Arial" w:cs="Arial"/>
+          <w:b w:val="0"/>
+          <w:i/>
+          <w:sz w:val="22"/>
+        </w:rPr>
+        <w:t>Add new…</w:t>
+      </w:r>
+      <w:r>
+        <w:rPr>
+          <w:rFonts w:ascii="Arial" w:hAnsi="Arial" w:eastAsia="Arial" w:cs="Arial"/>
+          <w:b w:val="0"/>
+          <w:i w:val="0"/>
+          <w:sz w:val="22"/>
+        </w:rPr>
+        <w:t xml:space="preserve"> “ISO-A4”: Font size 3,5; Start/End arrow type Arrow, ukuran 1; Show unit mati; Number of decimals 0 (semua ukuran bulat, jadi tampil 120, bukan 120,00).</w:t>
       </w:r>
     </w:p>
     <w:p>
@@ -9542,16 +9650,52 @@
           <w:i w:val="0"/>
           <w:sz w:val="22"/>
         </w:rPr>
-        <w:t xml:space="preserve">Kontur dan lubang: </w:t>
-      </w:r>
-      <w:r>
-        <w:rPr>
-          <w:rFonts w:ascii="Arial" w:hAnsi="Arial" w:eastAsia="Arial" w:cs="Arial"/>
-          <w:b w:val="0"/>
-          <w:i w:val="0"/>
-          <w:sz w:val="22"/>
-        </w:rPr>
-        <w:t>Pada layer Kontur: Draft Wire pelat 120 × 70 dengan chamfer C15 di sudut kanan-atas (lihat Gambar 1), Draft Circle ⌀20 di (60, 35), Part Cut. Pada layer Sumbu: dua Draft Line sumbu lubang, gaya Dashdot.</w:t>
+        <w:t xml:space="preserve">Kontur, lubang, dan sumbu: </w:t>
+      </w:r>
+      <w:r>
+        <w:rPr>
+          <w:rFonts w:ascii="Arial" w:hAnsi="Arial" w:eastAsia="Arial" w:cs="Arial"/>
+          <w:b w:val="0"/>
+          <w:i w:val="0"/>
+          <w:sz w:val="22"/>
+        </w:rPr>
+        <w:t xml:space="preserve">Klik kanan layer Kontur → </w:t>
+      </w:r>
+      <w:r>
+        <w:rPr>
+          <w:rFonts w:ascii="Arial" w:hAnsi="Arial" w:eastAsia="Arial" w:cs="Arial"/>
+          <w:b/>
+          <w:i w:val="0"/>
+          <w:sz w:val="22"/>
+        </w:rPr>
+        <w:t>Activate Layer</w:t>
+      </w:r>
+      <w:r>
+        <w:rPr>
+          <w:rFonts w:ascii="Arial" w:hAnsi="Arial" w:eastAsia="Arial" w:cs="Arial"/>
+          <w:b w:val="0"/>
+          <w:i w:val="0"/>
+          <w:sz w:val="22"/>
+        </w:rPr>
+        <w:t xml:space="preserve"> (objek Draft baru langsung masuk layer ini). Rectangle dengan Make face dari (0, 0, 0) ke (120, 70, 0). Circle Make face: arahkan kursor ke face persegi panjang; snap Center memberi titik tengahnya (60, 35); radius 10. Segitiga C15: Drafting → Polyline (Make face), titik pertama snap Endpoint di sudut (120, 70), centang </w:t>
+      </w:r>
+      <w:r>
+        <w:rPr>
+          <w:rFonts w:ascii="Arial" w:hAnsi="Arial" w:eastAsia="Arial" w:cs="Arial"/>
+          <w:b/>
+          <w:i w:val="0"/>
+          <w:sz w:val="22"/>
+        </w:rPr>
+        <w:t>Relative</w:t>
+      </w:r>
+      <w:r>
+        <w:rPr>
+          <w:rFonts w:ascii="Arial" w:hAnsi="Arial" w:eastAsia="Arial" w:cs="Arial"/>
+          <w:b w:val="0"/>
+          <w:i w:val="0"/>
+          <w:sz w:val="22"/>
+        </w:rPr>
+        <w:t>, ketik (−15, 0) dan (15, −15), lalu Close. Workbench Part → Boolean → Cut: persegi panjang − segitiga, lalu hasilnya − lingkaran → Cut001; masukkan ke layer Kontur. Aktifkan layer Sumbu, Line (Relative dimatikan) dari (45, 35) ke (75, 35), lalu Rotate + Copy 90° dengan pusat diklik di tepi lubang (snap Center) → sumbu tegak.</w:t>
       </w:r>
     </w:p>
     <w:p>
@@ -9584,7 +9728,25 @@
           <w:i w:val="0"/>
           <w:sz w:val="22"/>
         </w:rPr>
-        <w:t>Pada layer Dimensi: linear 120 (bawah) dan 70 (kiri), posisi lubang 60 dan 35 sebagai baseline dari sudut kiri-bawah, diameter ⌀20, dua kaki chamfer 15, angular 45°. Terapkan gaya ISO-A4 pada semuanya.</w:t>
+        <w:t xml:space="preserve">Aktifkan layer Dimensi. Annotation → Dimension: 120 (dua sudut bawah) dan 70 (dua sudut kiri); baseline 60 dan 35 dari titik asal ke pusat lubang sambil </w:t>
+      </w:r>
+      <w:r>
+        <w:rPr>
+          <w:rFonts w:ascii="Arial" w:hAnsi="Arial" w:eastAsia="Arial" w:cs="Arial"/>
+          <w:b/>
+          <w:i w:val="0"/>
+          <w:sz w:val="22"/>
+        </w:rPr>
+        <w:t>menahan Shift</w:t>
+      </w:r>
+      <w:r>
+        <w:rPr>
+          <w:rFonts w:ascii="Arial" w:hAnsi="Arial" w:eastAsia="Arial" w:cs="Arial"/>
+          <w:b w:val="0"/>
+          <w:i w:val="0"/>
+          <w:sz w:val="22"/>
+        </w:rPr>
+        <w:t xml:space="preserve"> agar dimensi mendatar atau tegak; mode Select Edge pada tepi lubang → ⌀20; Select Edge sisi atas lalu Alt+klik chamfer → sudut dalam 135° (= 180° − 45°; Draft hanya mengukur sudut di antara dua tepi yang ada). Pilih semua dimensi → View → Annotation Style = ISO-A4. Angka ⌀20 dipindah keluar lubang lewat View → Text Position (74, 45) agar tidak menimpa garis sumbu.</w:t>
       </w:r>
     </w:p>
     <w:p>
@@ -9617,7 +9779,7 @@
           <w:i w:val="0"/>
           <w:sz w:val="22"/>
         </w:rPr>
-        <w:t>Draft Label Custom “C15 × 45°” berpanah ke sisi chamfer; Draft Text dua baris: bahan dan toleransi umum. Masukkan ke layer Dimensi.</w:t>
+        <w:t>Annotation → Label: klik tengah chamfer, klik ujung penunjuk, klik letak teks; Data → Custom Text = “C15 × 45°” (kaki 15 mm dan sudut 45° dalam satu catatan). Annotation → Text: “Bahan: S275JR” ⏎ “Toleransi umum: ISO 2768-m” ⏎ ⏎. Label dan Text → Annotation Style ISO-A4; keduanya otomatis berada di layer Dimensi.</w:t>
       </w:r>
     </w:p>
     <w:p>
@@ -9650,7 +9812,7 @@
           <w:i w:val="0"/>
           <w:sz w:val="22"/>
         </w:rPr>
-        <w:t>Python console: App.ActiveDocument.Cut.Shape.Area → 7.973,34 mm². Sembunyikan layer Dimensi (Spasi) dan pastikan kontur tetap bersih.</w:t>
+        <w:t>Python console: App.ActiveDocument.Cut001.Shape.Area → 7.973,34 mm². Pilih layer Dimensi, tekan Spasi untuk menyembunyikan semua anotasi (kontur tetap bersih), lalu Spasi lagi untuk menampilkannya.</w:t>
       </w:r>
     </w:p>
     <w:p>
@@ -9683,7 +9845,61 @@
           <w:i w:val="0"/>
           <w:sz w:val="22"/>
         </w:rPr>
-        <w:t>TechDraw → Page Default; pilih objek Cut → Insert View; Scale 1:1; isi kepala gambar (judul, bahan, skala, nama); tambahkan TechDraw Length dimension untuk membandingkan dengan Draft Dimension.</w:t>
+        <w:t xml:space="preserve">Workbench TechDraw → Page → </w:t>
+      </w:r>
+      <w:r>
+        <w:rPr>
+          <w:rFonts w:ascii="Arial" w:hAnsi="Arial" w:eastAsia="Arial" w:cs="Arial"/>
+          <w:b/>
+          <w:i w:val="0"/>
+          <w:sz w:val="22"/>
+        </w:rPr>
+        <w:t>New Page From Template</w:t>
+      </w:r>
+      <w:r>
+        <w:rPr>
+          <w:rFonts w:ascii="Arial" w:hAnsi="Arial" w:eastAsia="Arial" w:cs="Arial"/>
+          <w:b w:val="0"/>
+          <w:i w:val="0"/>
+          <w:sz w:val="22"/>
+        </w:rPr>
+        <w:t xml:space="preserve"> → ISO/A4_Landscape_ISO5457_minimal.svg. Pilih Cut001 → TechDraw Views → New View, tombol kamera (arah Top dari tampilan 3D) → OK; Data → X 150, Y 132 (tengah area gambar, lega dari garis tepi dan kepala gambar), lalu Recompute. Klik kolom kepala gambar: Title, Created by, Approved by (nama dosen pengampu), Part Material. Klik tepi lubang → Centerlines/Threading → </w:t>
+      </w:r>
+      <w:r>
+        <w:rPr>
+          <w:rFonts w:ascii="Arial" w:hAnsi="Arial" w:eastAsia="Arial" w:cs="Arial"/>
+          <w:b/>
+          <w:i w:val="0"/>
+          <w:sz w:val="22"/>
+        </w:rPr>
+        <w:t>Circle Centerlines</w:t>
+      </w:r>
+      <w:r>
+        <w:rPr>
+          <w:rFonts w:ascii="Arial" w:hAnsi="Arial" w:eastAsia="Arial" w:cs="Arial"/>
+          <w:b w:val="0"/>
+          <w:i w:val="0"/>
+          <w:sz w:val="22"/>
+        </w:rPr>
+        <w:t xml:space="preserve">. Dimensi lembar: tepi bawah → Length (120); tepi kiri → Vertical Length (70); tepi kiri + garis sumbu tegak → Horizontal Length (60); tepi bawah + garis sumbu mendatar → Vertical Length (35); tepi lubang → Diameter (⌀20); dua titik ujung chamfer → Format/Organize Dimensions → </w:t>
+      </w:r>
+      <w:r>
+        <w:rPr>
+          <w:rFonts w:ascii="Arial" w:hAnsi="Arial" w:eastAsia="Arial" w:cs="Arial"/>
+          <w:b/>
+          <w:i w:val="0"/>
+          <w:sz w:val="22"/>
+        </w:rPr>
+        <w:t>Horizontal Chamfer Dimension</w:t>
+      </w:r>
+      <w:r>
+        <w:rPr>
+          <w:rFonts w:ascii="Arial" w:hAnsi="Arial" w:eastAsia="Arial" w:cs="Arial"/>
+          <w:b w:val="0"/>
+          <w:i w:val="0"/>
+          <w:sz w:val="22"/>
+        </w:rPr>
+        <w:t xml:space="preserve"> (15 × 45°). Seret setiap angka ke tempatnya: berjenjang, tidak menempel garis benda, tidak saling menumpuk.</w:t>
       </w:r>
     </w:p>
     <w:p>
@@ -9716,7 +9932,7 @@
           <w:i w:val="0"/>
           <w:sz w:val="22"/>
         </w:rPr>
-        <w:t>Ctrl+S → Latihan4_NIM.FCStd; TechDraw → Export page as PDF sebagai latihan (PDF tidak diunggah, .FCStd yang diunggah).</w:t>
+        <w:t>Ctrl+S → Latihan4_NIM.FCStd; File → Export PDF → Latihan4_NIM.pdf sebagai latihan (PDF tidak diunggah, .FCStd yang diunggah).</w:t>
       </w:r>
     </w:p>
     <w:p>
@@ -10002,7 +10218,7 @@
                 <w:i w:val="0"/>
                 <w:sz w:val="18"/>
               </w:rPr>
-              <w:t>Sudut angular menampilkan 135°</w:t>
+              <w:t>Sudut chamfer tampil 225°, bukan 135°</w:t>
             </w:r>
           </w:p>
         </w:tc>
@@ -10021,7 +10237,7 @@
                 <w:i w:val="0"/>
                 <w:sz w:val="18"/>
               </w:rPr>
-              <w:t>Busur dimensi ditempatkan di sisi luar</w:t>
+              <w:t>Busur dimensi diletakkan di luar pelat (sudut refleks)</w:t>
             </w:r>
           </w:p>
         </w:tc>
@@ -10040,7 +10256,7 @@
                 <w:i w:val="0"/>
                 <w:sz w:val="18"/>
               </w:rPr>
-              <w:t>Pindahkan titik penempatan ke dalam sudut 45°</w:t>
+              <w:t>Letakkan titik busur di dalam pelat, di antara sisi atas dan chamfer</w:t>
             </w:r>
           </w:p>
         </w:tc>

</xml_diff>